<commit_message>
Power gelijkgetrokken met de eigen berekening: 84% niet 85%, plus de bovengrens
De tekst gaf 85% power voor ulcusrecidief, de powercurve in Additional file 7 gaf 84%. Nagerekend bij n=122, HR 0,415 en 45,8 verwachte events komt de power op 84,47%, dus 84%. Tekst en figuur klopten niet met elkaar; de tekst is aangepast.

De gezamenlijke power stond alleen als 74%, het product onder onafhankelijkheid. Bij co-primaire eindpunten die beide moeten halen ligt die tussen het product en het minimum van beide, dus tussen 74% en 84%. Die bovengrens staat er nu bij; hij is eerlijk en gunstiger dan wat er stond.

Co-Authored-By: Claude Opus 5 <noreply@anthropic.com>
</commit_message>
<xml_diff>
--- a/protocol paper/PARADISE_protocol_manuscript.docx
+++ b/protocol paper/PARADISE_protocol_manuscript.docx
@@ -2665,7 +2665,7 @@
         <w:rPr>
           <w:lang w:val="en-GB"/>
         </w:rPr>
-        <w:t>Recruitment</w:t>
+        <w:t xml:space="preserve">Recruitment</w:t>
       </w:r>
     </w:p>
     <w:p ns2:paraId="11F66452" ns2:textId="466B0ACE">
@@ -2730,7 +2730,7 @@
         <w:rPr>
           <w:lang w:val="en-GB"/>
         </w:rPr>
-        <w:t>Comparator: usual care</w:t>
+        <w:t xml:space="preserve">Comparator: usual care</w:t>
       </w:r>
     </w:p>
     <w:p ns2:paraId="11F66455" ns2:textId="1C227BB7">
@@ -2805,7 +2805,7 @@
         <w:rPr>
           <w:lang w:val="en-GB"/>
         </w:rPr>
-        <w:t>Intervention: PARADISE</w:t>
+        <w:t xml:space="preserve">Intervention: PARADISE</w:t>
       </w:r>
     </w:p>
     <w:p ns2:paraId="11F66457" ns2:textId="77777777">
@@ -3450,7 +3450,7 @@
           <w:bCs/>
           <w:lang w:val="en-GB"/>
         </w:rPr>
-        <w:t>Exploratory outcome. Cumulative plantar tissue stress (Figure 5) is derived for each participant as the integral over follow-up of region-specific plantar pressure and weight-bearing activity, partitioned by whether prescribed footwear was worn, combining serial in-shoe pressure measurement with the Novel pedar system, continuous MoveMonitor activity profiling and continuous Orthotimer wear-time recording. Because in-shoe pressure is measured at three timepoints while activity and wear time are recorded continuously, pressure is carried forward between measurements; this approximation is stated explicitly and its influence examined by restricting analysis to the intervals immediately surrounding each pressure measurement.</w:t>
+        <w:t xml:space="preserve">Exploratory outcome. Cumulative plantar tissue stress (Figure 5) is derived for each participant as the integral over follow-up of region-specific plantar pressure and weight-bearing activity, partitioned by whether prescribed footwear was worn, combining serial in-shoe pressure measurement with the Novel pedar system, continuous MoveMonitor activity profiling and continuous Orthotimer wear-time recording. Because in-shoe pressure is measured at three timepoints while activity and wear time are recorded continuously, pressure is carried forward between measurements; this approximation is stated explicitly and its influence examined by restricting analysis to the intervals immediately surrounding each pressure measurement.</w:t>
       </w:r>
       <w:r>
         <w:rPr>
@@ -3793,7 +3793,7 @@
           <w:bCs/>
           <w:lang w:val="en-GB"/>
         </w:rPr>
-        <w:t xml:space="preserve">Final target and achieved power. Each of the six clinics will enrol 24 participants, giving 144 in total. This figure is set by balanced per-centre recruitment capacity and exceeds both calculated minima. Assuming 15% attrition and 122 analysable participants, achieved power is 85% for ulcer recurrence and 87% for footwear adherence; with complete follow-up, power is 90% and 92% respectively. Because the trial is declared positive only if both co-primary endpoints are met, the probability of succeeding on both is lower than either figure taken alone: assuming independence it is approximately 74%, and higher to the extent that the two endpoints are positively correlated, as the trial’s causal model predicts. This joint power is reported explicitly because presenting only the endpoint-specific figures would overstate the trial’s prospects of a positive result. Under attenuated effects, power for ulcer recurrence falls to 64% if PARADISE reduces 18-month recurrence to 30%, 52% if to 32.5%, and 40% if to 35%; the full relationship between assumed effect size and achieved power is shown in Additional file 7. The trial is therefore adequately powered for the hypothesised effect but would not reliably detect a benefit half the anticipated size, and results will be interpreted with confidence intervals rather than significance thresholds alone.</w:t>
+        <w:t xml:space="preserve">Final target and achieved power. Each of the six clinics will enrol 24 participants, giving 144 in total. This figure is set by balanced per-centre recruitment capacity and exceeds both calculated minima. Assuming 15% attrition and 122 analysable participants, achieved power is 84% for ulcer recurrence and 87% for footwear adherence; with complete follow-up, power is 90% and 92% respectively. Because the trial is declared positive only if both co-primary endpoints are met, the probability of succeeding on both is lower than either figure taken alone: under independence it is approximately 74%, rising towards an upper bound of 84% — the smaller of the two endpoint-specific figures — as the correlation between the endpoints increases, which the trial’s causal model predicts. The achievable range is therefore 74% to 84%. This joint power is reported explicitly because presenting only the endpoint-specific figures would overstate the trial’s prospects of a positive result. Under attenuated effects, power for ulcer recurrence falls to 64% if PARADISE reduces 18-month recurrence to 30%, 52% if to 32.5%, and 40% if to 35%; the full relationship between assumed effect size and achieved power is shown in Additional file 7. The trial is therefore adequately powered for the hypothesised effect but would not reliably detect a benefit half the anticipated size, and results will be interpreted with confidence intervals rather than significance thresholds alone.</w:t>
       </w:r>
       <w:r>
         <w:rPr>

</xml_diff>

<commit_message>
Strengths: gezamenlijke power als bewuste transparantiekeuze beschreven
De Discussion besprak de power alleen bij de beperkingen, waardoor het expliciet rapporteren van de gezamenlijke power nergens als sterkte stond. Protocols met co-primaire eindpunten melden doorgaans alleen de endpointspecifieke power, wat de kans op succes op het eigen criterium overschat.

Co-Authored-By: Claude Opus 5 <noreply@anthropic.com>
</commit_message>
<xml_diff>
--- a/protocol paper/PARADISE_protocol_manuscript.docx
+++ b/protocol paper/PARADISE_protocol_manuscript.docx
@@ -5401,6 +5401,31 @@
           <w:lang w:val="en-GB"/>
         </w:rPr>
         <w:t xml:space="preserve">address not only whether the service works but at what cost and through which mechanisms — the two questions on which any scale-up decision would turn.</w:t>
+      </w:r>
+    </w:p>
+    <w:p ns2:paraId="11F664A3" ns2:textId="77777777">
+      <w:pPr>
+        <w:spacing w:after="140" w:line="276" w:lineRule="auto"/>
+        <w:jc w:val="both"/>
+        <w:rPr>
+          <w:lang w:val="en-GB"/>
+        </w:rPr>
+      </w:pPr>
+      <w:r>
+        <w:rPr>
+          <w:lang w:val="en-GB"/>
+        </w:rPr>
+        <w:t>The trial is also explicit about what its own success criterion costs. Because PARADISE is declared positive only if both co-primary endpoints are met, the probability of a positive result is lower than either endpoint-specific figure: between 74% and 84% under the attrition assumption, depending on the correlation between recurrence and adherence. Protocols with co-primary outcomes commonly report only the endpoint-specific power, which overstates the prospect of success on the criterion by which the trial will actually be judged. Reporting the joint figure allows that prospect to be assessed before the trial begins rather than reconstructed afterwards, and it makes explicit that the design accepts a lower probability of an unambiguous result in exchange for a conclusion that rests on both the clinical outcome and the behavioural mechanism said to produce it.</w:t>
+      </w:r>
+      <w:r>
+        <w:rPr>
+          <w:lang w:val="en-GB"/>
+        </w:rPr>
+      </w:r>
+      <w:r>
+        <w:rPr>
+          <w:lang w:val="en-GB"/>
+        </w:rPr>
       </w:r>
     </w:p>
     <w:p ns2:paraId="11F664A4" ns2:textId="77777777">

</xml_diff>

<commit_message>
Referenties hernummerd na de nieuwe PEDIS-citatie
De citatie bij de vaatuitsluitingscriteria staat vroeger in de tekst dan waar de IWGDF-definitiestudie eerder voor het eerst werd aangehaald, waardoor de citatievolgorde niet meer klopte. Die bron schuift van 28 naar 25; 25 tot 27 schuiven een plaats op. Verder ongewijzigd. RIS bijgewerkt.

Co-Authored-By: Claude Opus 5 <noreply@anthropic.com>
</commit_message>
<xml_diff>
--- a/protocol paper/PARADISE_protocol_manuscript.docx
+++ b/protocol paper/PARADISE_protocol_manuscript.docx
@@ -2458,7 +2458,7 @@
         <w:rPr>
           <w:lang w:val="en-GB"/>
         </w:rPr>
-        <w:t>Participants will be excluded if they have undergone ray amputation, partial or complete, or major amputation including transmetatarsal forefoot amputation; present with an active foot ulcer, active Charcot neuroarthropathy, or a healed Charcot deformity with rocker-bottom or comparable structural collapse, for which the trial's offloading target and pressure-measurement protocol are not validated; have PEDIS perfusion grade 3 critical limb ischemia, defined as systolic ankle pressure below 50 mmHg, systolic toe pressure below 30 mmHg, or transcutaneous oxygen tension below 30 mmHg [28]; receive renal replacement therapy or immunosuppressive therapy; have a severe illness limiting 18-month survival in the judgement of the treating physician; are unable to consent or to follow study instructions; use devices preventing sensor application, such as an ankle-foot orthosis; or decline the specified protective footwear.</w:t>
+        <w:t xml:space="preserve">Participants will be excluded if they have undergone ray amputation, partial or complete, or major amputation including transmetatarsal forefoot amputation; present with an active foot ulcer, active Charcot neuroarthropathy, or a healed Charcot deformity with rocker-bottom or comparable structural collapse, for which the trial's offloading target and pressure-measurement protocol are not validated; have PEDIS perfusion grade 3 critical limb ischemia, defined as systolic ankle pressure below 50 mmHg, systolic toe pressure below 30 mmHg, or transcutaneous oxygen tension below 30 mmHg [25]; receive renal replacement therapy or immunosuppressive therapy; have a severe illness limiting 18-month survival in the judgement of the treating physician; are unable to consent or to follow study instructions; use devices preventing sensor application, such as an ankle-foot orthosis; or decline the specified protective footwear.</w:t>
       </w:r>
       <w:r>
         <w:rPr>
@@ -3058,7 +3058,7 @@
         <w:rPr>
           <w:lang w:val="en-GB"/>
         </w:rPr>
-        <w:t xml:space="preserve">Step 1, at baseline, assesses foot-care knowledge using the Nottingham Assessment of Functional Footcare [25] and health literacy, and delivers tailored education comprising written materials, demonstration of foot-care procedures and supervised practice. Step 2, at the three-month visit and coinciding with orthosis delivery and sensor integration, retests foot-care knowledge using the teach-back method, reinforces content where recall is incomplete, delivers education on wearing protective footwear indoors</w:t>
+        <w:t xml:space="preserve">Step 1, at baseline, assesses foot-care knowledge using the Nottingham Assessment of Functional Footcare [26] and health literacy, and delivers tailored education comprising written materials, demonstration of foot-care procedures and supervised practice. Step 2, at the three-month visit and coinciding with orthosis delivery and sensor integration, retests foot-care knowledge using the teach-back method, reinforces content where recall is incomplete, delivers education on wearing protective footwear indoors</w:t>
       </w:r>
       <w:r>
         <w:rPr>
@@ -3162,13 +3162,13 @@
         <w:rPr>
           <w:lang w:val="en-GB"/>
         </w:rPr>
-        <w:t xml:space="preserve"> Whether generalist teams can deliver these components under routine caseloads is the trial's central translational question, and two lines of evidence bear on it. Implementation of in-shoe pressure measurement in ordinary footwear practice has been formally evaluated, identifying both achievable success rates and the specific facilitators and barriers that determine them [26]; PARADISE incorporates that evidence by embedding pressure measurement within scheduled clinic visits rather than as a separate rese</w:t>
-      </w:r>
-      <w:r>
-        <w:rPr>
-          <w:lang w:val="en-GB"/>
-        </w:rPr>
-        <w:t xml:space="preserve">arch procedure, and by recording achieved pressure reduction per participant as a fidelity measure. Separately, a multi-modal programme combining education, motivational support and objective feedback has demonstrated short-term improvement in custom-made footwear use in a comparable high-risk population [27], establishing that adherence is modifiable by a bundled behavioural approach, though not over an 18-month horizon or under generalist delivery. Neither study establishes that SEBIA will be delivered wi</w:t>
+        <w:t xml:space="preserve"> Whether generalist teams can deliver these components under routine caseloads is the trial's central translational question, and two lines of evidence bear on it. Implementation of in-shoe pressure measurement in ordinary footwear practice has been formally evaluated, identifying both achievable success rates and the specific facilitators and barriers that determine them [27]; PARADISE incorporates that evidence by embedding pressure measurement within scheduled clinic visits rather than as a separate rese</w:t>
+      </w:r>
+      <w:r>
+        <w:rPr>
+          <w:lang w:val="en-GB"/>
+        </w:rPr>
+        <w:t xml:space="preserve">arch procedure, and by recording achieved pressure reduction per participant as a fidelity measure. Separately, a multi-modal programme combining education, motivational support and objective feedback has demonstrated short-term improvement in custom-made footwear use in a comparable high-risk population [28], establishing that adherence is modifiable by a bundled behavioural approach, though not over an 18-month horizon or under generalist delivery. Neither study establishes that SEBIA will be delivered wi</w:t>
       </w:r>
       <w:r>
         <w:rPr>
@@ -3264,7 +3264,7 @@
         <w:rPr>
           <w:lang w:val="en-GB"/>
         </w:rPr>
-        <w:t xml:space="preserve"> Foot ulcer recurrence is defined as the development of a new ulcer at the same or a different site following complete epithelialisation of a previous ulcer, applying the IWGDF definition of a foot ulcer as a break of the skin involving at least the epidermis and part of the dermis [28]. Friction- or pressure-related lesions on the lateral or dorsal foot occurring within three weeks of initiating new therapeutic footwear or insoles are not counted, as these reflect transient accommodation rather than recurr</w:t>
+        <w:t xml:space="preserve"> Foot ulcer recurrence is defined as the development of a new ulcer at the same or a different site following complete epithelialisation of a previous ulcer, applying the IWGDF definition of a foot ulcer as a break of the skin involving at least the epidermis and part of the dermis [25]. Friction- or pressure-related lesions on the lateral or dorsal foot occurring within three weeks of initiating new therapeutic footwear or insoles are not counted, as these reflect transient accommodation rather than recurr</w:t>
       </w:r>
       <w:r>
         <w:rPr>
@@ -4019,7 +4019,7 @@
         <w:rPr>
           <w:lang w:val="en-GB"/>
         </w:rPr>
-        <w:t>Trial governance rests with a steering group comprising the coordinating investigator, the six site principal investigators, the trial statistician and the health economist, which oversees conduct, approves protocol amendments and adjudicates data-access requests. No independent data monitoring committee has been constituted, reflecting the non-invasive, behavioural nature of the intervention and the absence of investigational medicinal products or implantable devices. Consistent with this, no interim efficacy analyses are planned and no formal stopping guidelines are defined: both arms receive guideline-concordant care unchanged throughout, and the intervention is additive to it. Because the primary outcome is itself the harm under study, safety is monitored through the six-monthly review of cumulative, arm-aggregated ulceration and amputation described below rather than through interim hypothesis testing. Because the trial's primary outcome is itself the harm under study, safety oversight is nonetheless formalised: the coordinating investigator and site principal investigators review cumulative, arm-aggregated ulceration and amputation counts every six months. If the cumulative incidence of ulceration or of any amputation in the PARADISE arm exceeds that in the usual-care arm by a margin inconsistent with chance at any scheduled review, an ad hoc independent review is convened and the ethics committee is notified. No formal interim efficacy analysis is planned and no stopping rule for benefit is defined; blinded aggregate data reviews are conducted for data-quality purposes only, without hypothesis testing or between-arm comparison.</w:t>
+        <w:t xml:space="preserve">Trial governance rests with a steering group comprising the coordinating investigator, the six site principal investigators, the trial statistician and the health economist, which oversees conduct, approves protocol amendments and adjudicates data-access requests. No independent data monitoring committee has been constituted, reflecting the non-invasive, behavioural nature of the intervention and the absence of investigational medicinal products or implantable devices. Consistent with this, no interim efficacy analyses are planned and no formal stopping guidelines are defined: both arms receive guideline-concordant care unchanged throughout, and the intervention is additive to it. Because the primary outcome is itself the harm under study, safety is monitored through the six-monthly review of cumulative, arm-aggregated ulceration and amputation described below rather than through interim hypothesis testing. Because the trial's primary outcome is itself the harm under study, safety oversight is nonetheless formalised: the coordinating investigator and site principal investigators review cumulative, arm-aggregated ulceration and amputation counts every six months. If the cumulative incidence of ulceration or of any amputation in the PARADISE arm exceeds that in the usual-care arm by a margin inconsistent with chance at any scheduled review, an ad hoc independent review is convened and the ethics committee is notified. No formal interim efficacy analysis is planned and no stopping rule for benefit is defined; blinded aggregate data reviews are conducted for data-quality purposes only, without hypothesis testing or between-arm comparison.</w:t>
       </w:r>
       <w:r>
         <w:rPr>
@@ -4788,7 +4788,7 @@
         <w:rPr>
           <w:lang w:val="en-GB"/>
         </w:rPr>
-        <w:t>Because an 18-month horizon cannot capture the consequences of a prevented recurrence — further ulceration, amputation, and long-term care costs unfold over years — a state-transition Markov model extrapolates to five years, with health states corresponding to the trial's own clinical categories: ulcer-free, active ulcer, healed, minor amputation, major amputation, and death. Transition probabilities were derived from trial data where available and from published cohorts otherwise, with all external parameters and their sources tabulated and varied in the sensitivity analysis. Prior modelling provides the comparators against which the resulting estimates will be interpreted: in high-risk patients, prevention concordant with the International Consensus on the Diabetic Foot was cost-saving, at €800 to €969 lower cost per patient over five years at 1998 prices, under a baseline assumption of 25% lower incidence of foot ulcers and lower-extremity amputation [37]; and guideline-based care was cost-effective over a lifetime horizon at under US$25,000 per QALY gained [38]. A trial-based evaluation of at-home temperature monitoring in the same population and over the same 18-month horizon reported, as a secondary outcome, an ICER of €−11,580 per ulcer prevented with a 79% probability of cost-effectiveness on that outcome [39]. On its primary cost-utility outcome the same trial was at best equally cost-effective: foot-care costs were lower (€6067 versus €7376) and fewer participants had a recurrence (36% versus 47%), but quality-adjusted life years were also lower (1.09 versus 1.12), giving a 45% probability of cost-effectiveness at a willingness-to-accept of €50,000 per QALY [39]. That divergence between the two metrics is itself instructive, and is why the present evaluation reports cost per ulcer prevented and cost per quality-adjusted life year alongside one another rather than selecting whichever is the more favourable.</w:t>
+        <w:t xml:space="preserve">Because an 18-month horizon cannot capture the consequences of a prevented recurrence — further ulceration, amputation, and long-term care costs unfold over years — a state-transition Markov model extrapolates to five years, with health states corresponding to the trial's own clinical categories: ulcer-free, active ulcer, healed, minor amputation, major amputation, and death. Transition probabilities were derived from trial data where available and from published cohorts otherwise, with all external parameters and their sources tabulated and varied in the sensitivity analysis. Prior modelling provides the comparators against which the resulting estimates will be interpreted: in high-risk patients, prevention concordant with the International Consensus on the Diabetic Foot was cost-saving, at €800 to €969 lower cost per patient over five years at 1998 prices, under a baseline assumption of 25% lower incidence of foot ulcers and lower-extremity amputation [37]; and guideline-based care was cost-effective over a lifetime horizon at under US$25,000 per QALY gained [38]. A trial-based evaluation of at-home temperature monitoring in the same population and over the same 18-month horizon reported, as a secondary outcome, an ICER of €−11,580 per ulcer prevented with a 79% probability of cost-effectiveness on that outcome [39]. On its primary cost-utility outcome the same trial was at best equally cost-effective: foot-care costs were lower (€6067 versus €7376) and fewer participants had a recurrence (36% versus 47%), but quality-adjusted life years were also lower (1.09 versus 1.12), giving a 45% probability of cost-effectiveness at a willingness-to-accept of €50,000 per QALY [39]. That divergence between the two metrics is itself instructive, and is why the present evaluation reports cost per ulcer prevented and cost per quality-adjusted life year alongside one another rather than selecting whichever is the more favourable.</w:t>
       </w:r>
       <w:r>
         <w:rPr>
@@ -5025,7 +5025,7 @@
         <w:rPr>
           <w:lang w:val="en-GB"/>
         </w:rPr>
-        <w:t>Written informed consent is obtained from all participants and from participating therapists before any study-specific procedure. In accordance with the Belgian law of 7 May 2004 concerning experiments on human persons, the sponsor assumes liability without fault for damage incurred by a participant and linked directly or indirectly to participation, and provides compensation through its insurance. Participants may withdraw at any time without prejudice to further treatment; data collected before withdrawal may be retained and analysed, and no new data are collected thereafter, as stated in the consent documentation. All source data are pseudonymised and stored with restricted access.</w:t>
+        <w:t xml:space="preserve">Written informed consent is obtained from all participants and from participating therapists before any study-specific procedure. In accordance with the Belgian law of 7 May 2004 concerning experiments on human persons, the sponsor assumes liability without fault for damage incurred by a participant and linked directly or indirectly to participation, and provides compensation through its insurance. Participants may withdraw at any time without prejudice to further treatment; data collected before withdrawal may be retained and analysed, and no new data are collected thereafter, as stated in the consent documentation. All source data are pseudonymised and stored with restricted access.</w:t>
       </w:r>
     </w:p>
     <w:p ns2:paraId="11F66497" ns2:textId="77777777">
@@ -5202,7 +5202,7 @@
         <w:rPr>
           <w:lang w:val="en-GB"/>
         </w:rPr>
-        <w:t>Recruitment has not commenced. The investigation will not begin until ethics committee and competent authority approvals have been obtained; this manuscript accompanies that submission. Protocol version 1.0, dated 17 May 2026. Anticipated recruitment start ▮.</w:t>
+        <w:t xml:space="preserve">Recruitment has not commenced. The investigation will not begin until ethics committee and competent authority approvals have been obtained; this manuscript accompanies that submission. Protocol version 1.0, dated 17 May 2026. Anticipated recruitment start ▮.</w:t>
       </w:r>
       <w:proofErr w:type="gramStart"/>
       <w:r>
@@ -6110,7 +6110,7 @@
           <w:bCs/>
           <w:lang w:val="en-GB"/>
         </w:rPr>
-        <w:t>Trial sponsor. KU Leuven, Department of Rehabilitation Sciences, Spoorwegstraat 12, 8200 Bruges, Belgium (study reference S71769). The sponsor is an academic institution and is not a commercial entity.</w:t>
+        <w:t xml:space="preserve">Trial sponsor. KU Leuven, Department of Rehabilitation Sciences, Spoorwegstraat 12, 8200 Bruges, Belgium (study reference S71769). The sponsor is an academic institution and is not a commercial entity.</w:t>
       </w:r>
       <w:r>
         <w:rPr>
@@ -7735,7 +7735,7 @@
           <w:szCs w:val="20"/>
           <w:lang w:val="en-GB"/>
         </w:rPr>
-        <w:t>25. Lincoln NB, Jeffcoate WJ, Ince P, Smith M, Radford KA. Validation of a new measure of protective footcare behaviour: the Nottingham Assessment of Functional Footcare (NAFF). Practical Diabetes International. 2007;24(4):207–211. doi:10.1002/pdi.1099</w:t>
+        <w:t>25. van Netten JJ, Bus SA, Apelqvist J, Chen P, Chuter V, Fitridge R, et al. Definitions and criteria for diabetes-related foot disease (IWGDF 2023 update). Diabetes Metab Res Rev. 2024;40(3):e3654. doi:10.1002/dmrr.3654</w:t>
       </w:r>
       <w:r>
         <w:rPr>
@@ -7768,7 +7768,7 @@
           <w:sz w:val="20"/>
           <w:szCs w:val="20"/>
         </w:rPr>
-        <w:t>26. Zwaferink JBJ, Nollet F, Bus SA. In-shoe pressure measurements in diabetic footwear practice: success rate and facilitators of and barriers to implementation. Sensors. 2024;24(6):1795. doi:10.3390/s24061795</w:t>
+        <w:t>26. Lincoln NB, Jeffcoate WJ, Ince P, Smith M, Radford KA. Validation of a new measure of protective footcare behaviour: the Nottingham Assessment of Functional Footcare (NAFF). Practical Diabetes International. 2007;24(4):207–211. doi:10.1002/pdi.1099</w:t>
       </w:r>
       <w:r>
         <w:rPr>
@@ -7844,7 +7844,7 @@
           <w:sz w:val="20"/>
           <w:szCs w:val="20"/>
         </w:rPr>
-        <w:t>27. van Netten JJ, Vossen LE, Driebergen FM, Wolthuis D, Merkx MJM, Bus SA. Short-term efficacy of a multi-modal intervention program to improve custom-made footwear use in people at high risk of diabetes-related foot ulceration. J Clin Med. 2025;14(11):3635. doi:10.3390/jcm14113635</w:t>
+        <w:t>27. Zwaferink JBJ, Nollet F, Bus SA. In-shoe pressure measurements in diabetic footwear practice: success rate and facilitators of and barriers to implementation. Sensors. 2024;24(6):1795. doi:10.3390/s24061795</w:t>
       </w:r>
       <w:r>
         <w:rPr>
@@ -7881,7 +7881,7 @@
           <w:sz w:val="20"/>
           <w:szCs w:val="20"/>
         </w:rPr>
-        <w:t>28. van Netten JJ, Bus SA, Apelqvist J, Chen P, Chuter V, Fitridge R, et al. Definitions and criteria for diabetes-related foot disease (IWGDF 2023 update). Diabetes Metab Res Rev. 2024;40(3):e3654. doi:10.1002/dmrr.3654</w:t>
+        <w:t>28. van Netten JJ, Vossen LE, Driebergen FM, Wolthuis D, Merkx MJM, Bus SA. Short-term efficacy of a multi-modal intervention program to improve custom-made footwear use in people at high risk of diabetes-related foot ulceration. J Clin Med. 2025;14(11):3635. doi:10.3390/jcm14113635</w:t>
       </w:r>
       <w:r>
         <w:rPr>

</xml_diff>

<commit_message>
Deponeringsbelofte uit het manuscript gehaald
Het manuscript zegde toe de individuele deelnemersdataset en de biomechanische dataset in een repository te deponeren voor hergebruik door derden. Het toestemmingsformulier bevat daarvoor geen bepaling, waardoor die toezegging niet nakomelijk was zonder de deelnemers opnieuw te benaderen.

Vervangen door een verklaring die beschrijft wat wel kan: analyseplan en analysecode openbaar, en verzoeken om deelnemersgegevens per geval beoordeeld, met goedkeuring van het ethisch comite, een data access agreement en een gebruik dat strookt met de gegeven toestemming. De alinea met de tweede deponeringsbelofte is geschrapt, evenals de afkorting FAIR die daarmee ongebruikt werd.

De constatering over het toestemmingsformulier staat bewust niet in het manuscript; dat is een punt voor de ethiekindiening.

Co-Authored-By: Claude Opus 5 <noreply@anthropic.com>
</commit_message>
<xml_diff>
--- a/protocol paper/PARADISE_protocol_manuscript.docx
+++ b/protocol paper/PARADISE_protocol_manuscript.docx
@@ -5836,129 +5836,111 @@
         <w:rPr>
           <w:lang w:val="en-GB"/>
         </w:rPr>
-        <w:t xml:space="preserve">ADA, American Diabetes Association; AE, adverse event; CHEERS, Consolidated Health Economic Evaluation Reporting Standards; CI, confidence interval; CMFO, custom-made foot orthosis; COM-B, Capability–Opportunity–Motivation–Behaviour; CONSORT, Consolidated Standards of Reporting Trials; DFC, diabetic foot clinic;</w:t>
-      </w:r>
-      <w:r>
-        <w:rPr>
-          <w:lang w:val="en-GB"/>
-        </w:rPr>
-        <w:t xml:space="preserve"/>
-      </w:r>
-      <w:r>
-        <w:rPr>
-          <w:lang w:val="en-GB"/>
-        </w:rPr>
-        <w:t xml:space="preserve"> DFD, diabetes-related foot disease; EASD, European Association for the Study of Diabetes; eCRF, electronic case report form; EQ-5D-5L, </w:t>
+        <w:t>ADA, American Diabetes Association; AE, adverse event; CHEERS, Consolidated Health Economic Evaluation Reporting Standards; CI, confidence interval; CMFO, custom-made foot orthosis; COM-B, Capability–Opportunity–Motivation–Behaviour; CONSORT, Consolidated Standards of Reporting Trials; DFC, diabetic foot clinic; DFD, diabetes-related foot disease; EASD, European Association for the Study of Diabetes; eCRF, electronic case report form; EQ-5D-5L, EuroQol five-dimension five-level questionnaire; GCP, Good Clinical Practice; GDPR, General Data Protection Regulation; ICER, incremental cost-effectiveness ratio; ICH, International Council for Harmonisation; ICMJE, International Committee of Medical Journal Editors; ICUR, incremental cost-utility ratio; iMCQ, iMTA Medical Consumption Questionnaire; iPCQ, iMTA Productivity Cost Questionnaire; ISO, International Organization for Standardization; IWGDF, International Working Group on the Diabetic Foot; MDR, Medical Device Regulation; MRC, Medical Research Council; NAFF, Nottingham Assessment of Functional Footcare; PEDIS, Perfusion, Extent, Depth, Infection, Sensation; PPI, patient and public involvement; PRECIS-2, Pragmatic-Explanatory Continuum Indicator Summary 2; QALY, quality-adjusted life year; RIZIV–INAMI, Belgian National Institute for Health and Disability Insurance; SAE, serious adverse event; SAP, statistical analysis plan; SEBIA, Structured Education and Behavioural Intervention Approach; SPIRIT, Standard Protocol Items: Recommendations for Interventional Trials; TIDieR, Template for Intervention Description and Replication; WIfI, Wound, Ischaemia and foot Infection.</w:t>
+      </w:r>
+      <w:r>
+        <w:rPr>
+          <w:lang w:val="en-GB"/>
+        </w:rPr>
+      </w:r>
+      <w:r>
+        <w:rPr>
+          <w:lang w:val="en-GB"/>
+        </w:rPr>
       </w:r>
       <w:proofErr w:type="spellStart"/>
       <w:r>
         <w:rPr>
           <w:lang w:val="en-GB"/>
         </w:rPr>
-        <w:t xml:space="preserve">EuroQol</w:t>
       </w:r>
       <w:proofErr w:type="spellEnd"/>
       <w:r>
         <w:rPr>
           <w:lang w:val="en-GB"/>
         </w:rPr>
-        <w:t xml:space="preserve"> five-dimension five-level questionnaire; FAIR, Findable, Accessible, Interoperable and Reusable; GCP, Good Clinical Practice; GDPR, General Data Protection Regulation; ICER, </w:t>
-      </w:r>
-      <w:r>
-        <w:rPr>
-          <w:lang w:val="en-GB"/>
-        </w:rPr>
-        <w:t xml:space="preserve">incremental cost-effectiveness ratio; ICH, International Council for Harmonisation; ICMJE, International Committee of Medical Journal Editors; ICUR, incremental cost-utility ratio; </w:t>
+      </w:r>
+      <w:r>
+        <w:rPr>
+          <w:lang w:val="en-GB"/>
+        </w:rPr>
       </w:r>
       <w:proofErr w:type="spellStart"/>
       <w:r>
         <w:rPr>
           <w:lang w:val="en-GB"/>
         </w:rPr>
-        <w:t xml:space="preserve">iMCQ</w:t>
       </w:r>
       <w:proofErr w:type="spellEnd"/>
       <w:r>
         <w:rPr>
           <w:lang w:val="en-GB"/>
         </w:rPr>
-        <w:t xml:space="preserve">, </w:t>
       </w:r>
       <w:proofErr w:type="spellStart"/>
       <w:r>
         <w:rPr>
           <w:lang w:val="en-GB"/>
         </w:rPr>
-        <w:t xml:space="preserve">iMTA</w:t>
       </w:r>
       <w:proofErr w:type="spellEnd"/>
       <w:r>
         <w:rPr>
           <w:lang w:val="en-GB"/>
         </w:rPr>
-        <w:t xml:space="preserve"> Medical Consumption Questionnaire; </w:t>
       </w:r>
       <w:proofErr w:type="spellStart"/>
       <w:r>
         <w:rPr>
           <w:lang w:val="en-GB"/>
         </w:rPr>
-        <w:t xml:space="preserve">iPCQ</w:t>
       </w:r>
       <w:proofErr w:type="spellEnd"/>
       <w:r>
         <w:rPr>
           <w:lang w:val="en-GB"/>
         </w:rPr>
-        <w:t xml:space="preserve">, </w:t>
       </w:r>
       <w:proofErr w:type="spellStart"/>
       <w:r>
         <w:rPr>
           <w:lang w:val="en-GB"/>
         </w:rPr>
-        <w:t xml:space="preserve">iMTA</w:t>
       </w:r>
       <w:proofErr w:type="spellEnd"/>
       <w:r>
         <w:rPr>
           <w:lang w:val="en-GB"/>
         </w:rPr>
-        <w:t xml:space="preserve"> Productivity Cost Questionnaire; ISO, International Organization for Standardization; IWGDF, International Working Group on the Diabetic Foot; MDR, Medical Device Regulation; MRC, Medical Research Council; NAFF, Nottingham Assessment of Functional Footcare; PEDIS, Perfusion, Extent, Depth, Infection, Sensation; PPI, patient and public involvement; PRECIS-2, Pragmatic-Explanatory Continuum Indicator Summary 2;</w:t>
-      </w:r>
-      <w:r>
-        <w:rPr>
-          <w:lang w:val="en-GB"/>
-        </w:rPr>
-        <w:t xml:space="preserve"> QALY, quality-adjusted life year; RIZIV–INAMI, Belgian National Institute for Health and Disability Insurance; SAE, serious adverse event; SAP, statistical analysis plan; SEBIA, Structured Education and Behavioural Intervention Approach; SPIRIT, Standard Protocol Items: Recommendations for Interventional Trials; </w:t>
+      </w:r>
+      <w:r>
+        <w:rPr>
+          <w:lang w:val="en-GB"/>
+        </w:rPr>
       </w:r>
       <w:proofErr w:type="spellStart"/>
       <w:r>
         <w:rPr>
           <w:lang w:val="en-GB"/>
         </w:rPr>
-        <w:t xml:space="preserve">TIDieR</w:t>
       </w:r>
       <w:proofErr w:type="spellEnd"/>
       <w:r>
         <w:rPr>
           <w:lang w:val="en-GB"/>
         </w:rPr>
-        <w:t xml:space="preserve">, Template for Intervention Description and Replication; </w:t>
       </w:r>
       <w:proofErr w:type="spellStart"/>
       <w:r>
         <w:rPr>
           <w:lang w:val="en-GB"/>
         </w:rPr>
-        <w:t xml:space="preserve">WIfI</w:t>
       </w:r>
       <w:proofErr w:type="spellEnd"/>
       <w:r>
         <w:rPr>
           <w:lang w:val="en-GB"/>
         </w:rPr>
-        <w:t xml:space="preserve">, Wound, Ischaemia and foot Infection.</w:t>
       </w:r>
     </w:p>
     <w:p ns2:paraId="11F664B7" ns2:textId="77777777">
@@ -6042,34 +6024,12 @@
           <w:bCs/>
           <w:lang w:val="en-GB"/>
         </w:rPr>
-        <w:t xml:space="preserve">Availability of data and materials.</w:t>
-      </w:r>
-      <w:r>
-        <w:rPr>
-          <w:lang w:val="en-GB"/>
-        </w:rPr>
-        <w:t xml:space="preserve"> The de-identified individual participant dataset underlying published results, together with the data dictionary, statistical analysis plan and analysis code, will be deposited in a recognised repository and made available to qualified researchers following approval of a methodologically sound proposal by the trial steering group, from twelve months after publication of the primary results. Requests should be directed to the corresponding author. Access requires a signed data access agreement.</w:t>
-      </w:r>
-    </w:p>
-    <w:p ns2:paraId="11F664BB" ns2:textId="77777777">
-      <w:pPr>
-        <w:spacing w:after="140" w:line="276" w:lineRule="auto"/>
-        <w:jc w:val="both"/>
-        <w:rPr>
-          <w:lang w:val="en-GB"/>
-        </w:rPr>
-      </w:pPr>
-      <w:r>
-        <w:rPr>
-          <w:lang w:val="en-GB"/>
-        </w:rPr>
-        <w:t xml:space="preserve">The linked biomechanical dataset — serial in-shoe plantar pressure, continuous weight-bearing activity and continuous offloading wear time with time-stamped ulcer outcomes — will be deposited separately, with its derivation code and achieved completeness reported alongside it. Prior attempts to characterise cumulative plantar tissue stress have been constrained by sample size and data completeness rather than by analytical method [15]; releasing this dataset as a reusable resource, including the intervals w</w:t>
-      </w:r>
-      <w:r>
-        <w:rPr>
-          <w:lang w:val="en-GB"/>
-        </w:rPr>
-        <w:t xml:space="preserve">here measurement failed, allows the field to pool across cohorts rather than repeat small studies independently. Data are curated to FAIR principles.</w:t>
+        <w:t>Availability of data and materials. The statistical analysis plan and the analysis code supporting the published results will be made publicly available. Requests for access to de-identified individual participant data, including the linked biomechanical dataset of serial in-shoe plantar pressure, continuous weight-bearing activity and continuous offloading wear time with time-stamped ulcer outcomes, will be considered on a case-by-case basis by the trial steering group from twelve months after publication of the primary results. Any such access requires approval by the ethics committee, a signed data access agreement, and a proposed use consistent with the consent given by participants. Requests should be directed to the corresponding author.</w:t>
+      </w:r>
+      <w:r>
+        <w:rPr>
+          <w:lang w:val="en-GB"/>
+        </w:rPr>
       </w:r>
     </w:p>
     <w:p ns2:paraId="11F664BC" ns2:textId="77777777">

</xml_diff>

<commit_message>
Manuscript: het adherentie-eindpunt staat op de waaktijd
De twee alinea's die het eindpunt definieren - de meetopstelling en de formele
definitie - spraken nog van de tijd die nodig is om de eigen gewichtsdragende
activiteit in beschermend schoeisel af te leggen. Dat is nu de waaktijd, de tijd
tussen opstaan en slapengaan, afgeleid uit het baseline-MoveMonitorprofiel.
Tabel 3 was al eerder gelijkgezet.

Op vijf andere plaatsen blijft "weight-bearing activity" staan, en dat is geen
vergetelheid. Die gaan over cumulatieve plantaire weefselbelasting: druk maal
gewichtsdragende activiteit maal of het schoeisel gedragen werd. Een ander
construct met een eigen literatuur. Wie daar de waaktijd invult, maakt de
exploratieve analyse onjuist. Punt 14 in PARADISE_BRONNEN.md zegt dat er nu
expliciet bij.

Co-Authored-By: Claude Opus 5 <noreply@anthropic.com>
</commit_message>
<xml_diff>
--- a/protocol paper/PARADISE_protocol_manuscript.docx
+++ b/protocol paper/PARADISE_protocol_manuscript.docx
@@ -3002,7 +3002,7 @@
         <w:rPr>
           <w:lang w:val="en-GB"/>
         </w:rPr>
-        <w:t xml:space="preserve"> accelerometer (McRoberts BV, The Hague, Netherlands). Together these define an individualised, activity-derived wear-time target for each participant: the wear time that would be required for the participant's own habitual weight-bearing activity to be performed in protective footwear. Adher</w:t>
+        <w:t xml:space="preserve"> accelerometer (McRoberts BV, The Hague, Netherlands). Together these define an individualised, activity-derived wear-time target for each participant: the participant's habitual waking hours, that is, the time between rising and going to bed, during which protective footwear is expected to be worn. Adher</w:t>
       </w:r>
       <w:r>
         <w:rPr>
@@ -3285,14 +3285,13 @@
         <w:rPr>
           <w:lang w:val="en-GB"/>
         </w:rPr>
-        <w:t xml:space="preserve">Footwear adherence is defined as the proportion of the individualised, activity-derived wear-time target achieved — that is, the wear time required for the participant’s own habitual weight-bearing </w:t>
-      </w:r>
-      <w:r>
-        <w:rPr>
-          <w:lang w:val="en-GB"/>
-        </w:rPr>
-        <w:lastRenderedPageBreak/>
-        <w:t xml:space="preserve">activity to be performed in protective footwear, rather than a fixed daily hour count that would penalise inactive participants and flatter active ones — averaged across all seven days of the week, read out three-monthly, with the primary analysis timepoint at 12 months and the full 18-month profile reported as a secondary summary, derived from continuous Orthotimer temperature-sensor recording combined with the </w:t>
+        <w:t>Footwear adherence is defined as the proportion of the individualised, activity-derived wear-time target achieved — that is, the participant’s habitual waking hours derived from the baseline MoveMonitor profile, rather than a fixed daily hour count that would penalise inactive participants and flatter active ones</w:t>
+      </w:r>
+      <w:r>
+        <w:rPr>
+          <w:lang w:val="en-GB"/>
+        </w:rPr>
+        <w:t xml:space="preserve"> — averaged across all seven days of the week, read out three-monthly, with the primary analysis timepoint at 12 months and the full 18-month profile reported as a secondary summary, derived from continuous Orthotimer temperature-sensor recording combined with the </w:t>
       </w:r>
       <w:proofErr w:type="spellStart"/>
       <w:r>

</xml_diff>